<commit_message>
docs: Sprint Retorspective 7
</commit_message>
<xml_diff>
--- a/documentation/Sprint Retrospective6.docx
+++ b/documentation/Sprint Retrospective6.docx
@@ -53,14 +53,12 @@
         </w:rPr>
         <w:t xml:space="preserve"> </w:t>
       </w:r>
-      <w:proofErr w:type="spellStart"/>
       <w:r>
         <w:rPr>
           <w:rFonts w:ascii="Cascadia Mono" w:hAnsi="Cascadia Mono"/>
         </w:rPr>
         <w:t>NightOwls</w:t>
       </w:r>
-      <w:proofErr w:type="spellEnd"/>
       <w:r>
         <w:rPr>
           <w:rFonts w:ascii="Cascadia Mono" w:hAnsi="Cascadia Mono"/>
@@ -123,7 +121,7 @@
         <w:rPr>
           <w:rFonts w:ascii="Cascadia Mono" w:hAnsi="Cascadia Mono"/>
         </w:rPr>
-        <w:t>19</w:t>
+        <w:t>30</w:t>
       </w:r>
       <w:r>
         <w:rPr>
@@ -262,16 +260,8 @@
         <w:rPr>
           <w:rFonts w:ascii="Cascadia Mono" w:hAnsi="Cascadia Mono"/>
         </w:rPr>
-        <w:t xml:space="preserve"> Nenad </w:t>
-      </w:r>
-      <w:proofErr w:type="spellStart"/>
-      <w:r>
-        <w:rPr>
-          <w:rFonts w:ascii="Cascadia Mono" w:hAnsi="Cascadia Mono"/>
-        </w:rPr>
-        <w:t>Jevremović</w:t>
-      </w:r>
-      <w:proofErr w:type="spellEnd"/>
+        <w:t xml:space="preserve"> Nenad Jevremović</w:t>
+      </w:r>
     </w:p>
     <w:p>
       <w:pPr>
@@ -310,7 +300,7 @@
           <w:b/>
           <w:bCs/>
         </w:rPr>
-        <w:t>5</w:t>
+        <w:t>6</w:t>
       </w:r>
       <w:r>
         <w:rPr>
@@ -469,21 +459,7 @@
         <w:rPr>
           <w:rFonts w:ascii="Cascadia Mono" w:hAnsi="Cascadia Mono"/>
         </w:rPr>
-        <w:t xml:space="preserve">Cleaning up </w:t>
-      </w:r>
-      <w:proofErr w:type="spellStart"/>
-      <w:r>
-        <w:rPr>
-          <w:rFonts w:ascii="Cascadia Mono" w:hAnsi="Cascadia Mono"/>
-        </w:rPr>
-        <w:t>css</w:t>
-      </w:r>
-      <w:proofErr w:type="spellEnd"/>
-      <w:r>
-        <w:rPr>
-          <w:rFonts w:ascii="Cascadia Mono" w:hAnsi="Cascadia Mono"/>
-        </w:rPr>
-        <w:t xml:space="preserve"> and html for web frontend.</w:t>
+        <w:t>Cleaning up css and html for web frontend.</w:t>
       </w:r>
     </w:p>
     <w:p>

</xml_diff>